<commit_message>
docs: W2 Day8 课件与摘要
</commit_message>
<xml_diff>
--- a/学习摘要/W2-学习摘要.docx
+++ b/学习摘要/W2-学习摘要.docx
@@ -1970,6 +1970,1066 @@
         <w:t>display 与 position：块级、行内、inline-block、flex、none 五种显示方式的区别，以及 static / relative / absolute / fixed / sticky 五种定位。这是把元素「摆到该在的位置」的工具箱。</w:t>
       </w:r>
     </w:p>
+    <w:p>
+      <w:r>
+        <w:br w:type="page"/>
+      </w:r>
+    </w:p>
+    <w:p>
+      <w:pPr>
+        <w:pStyle w:val="Heading2"/>
+      </w:pPr>
+      <w:r>
+        <w:t>第 8 天 · 2026-10-28</w:t>
+      </w:r>
+    </w:p>
+    <w:p>
+      <w:pPr>
+        <w:pStyle w:val="Heading3"/>
+      </w:pPr>
+      <w:r>
+        <w:t>一、今天犯的错误</w:t>
+      </w:r>
+    </w:p>
+    <w:tbl>
+      <w:tblPr>
+        <w:tblStyle w:val="TableGrid"/>
+        <w:tblW w:type="auto" w:w="0"/>
+        <w:tblLook w:firstColumn="1" w:firstRow="1" w:lastColumn="0" w:lastRow="0" w:noHBand="0" w:noVBand="1" w:val="04A0"/>
+      </w:tblPr>
+      <w:tblGrid>
+        <w:gridCol w:w="3213"/>
+        <w:gridCol w:w="3213"/>
+        <w:gridCol w:w="3213"/>
+      </w:tblGrid>
+      <w:tr>
+        <w:tc>
+          <w:tcPr>
+            <w:tcW w:type="dxa" w:w="3213"/>
+          </w:tcPr>
+          <w:p>
+            <w:r>
+              <w:rPr>
+                <w:b/>
+              </w:rPr>
+              <w:t>错误</w:t>
+            </w:r>
+          </w:p>
+        </w:tc>
+        <w:tc>
+          <w:tcPr>
+            <w:tcW w:type="dxa" w:w="3213"/>
+          </w:tcPr>
+          <w:p>
+            <w:r>
+              <w:rPr>
+                <w:b/>
+              </w:rPr>
+              <w:t>发生了什么</w:t>
+            </w:r>
+          </w:p>
+        </w:tc>
+        <w:tc>
+          <w:tcPr>
+            <w:tcW w:type="dxa" w:w="3213"/>
+          </w:tcPr>
+          <w:p>
+            <w:r>
+              <w:rPr>
+                <w:b/>
+              </w:rPr>
+              <w:t>以后怎么办</w:t>
+            </w:r>
+          </w:p>
+        </w:tc>
+      </w:tr>
+      <w:tr>
+        <w:tc>
+          <w:tcPr>
+            <w:tcW w:type="dxa" w:w="3213"/>
+          </w:tcPr>
+          <w:p>
+            <w:r>
+              <w:t>同一个属性写了两遍</w:t>
+            </w:r>
+          </w:p>
+        </w:tc>
+        <w:tc>
+          <w:tcPr>
+            <w:tcW w:type="dxa" w:w="3213"/>
+          </w:tcPr>
+          <w:p>
+            <w:r>
+              <w:t>nav a 里先写 padding: 6px 12px，隔一行又写 padding: 0 4px。层叠规则下后写的覆盖前写的，所以实际生效的是 0 4px，导航看起来没有上下留白。</w:t>
+            </w:r>
+          </w:p>
+        </w:tc>
+        <w:tc>
+          <w:tcPr>
+            <w:tcW w:type="dxa" w:w="3213"/>
+          </w:tcPr>
+          <w:p>
+            <w:r>
+              <w:t>同一属性只出现一次。写完一段样式扫一眼，看有没有重复的键。</w:t>
+            </w:r>
+          </w:p>
+        </w:tc>
+      </w:tr>
+      <w:tr>
+        <w:tc>
+          <w:tcPr>
+            <w:tcW w:type="dxa" w:w="3213"/>
+          </w:tcPr>
+          <w:p>
+            <w:r>
+              <w:t>注释重复</w:t>
+            </w:r>
+          </w:p>
+        </w:tc>
+        <w:tc>
+          <w:tcPr>
+            <w:tcW w:type="dxa" w:w="3213"/>
+          </w:tcPr>
+          <w:p>
+            <w:r>
+              <w:t>opacity: 0 和 opacity: 1 两行都贴了同一句注释。</w:t>
+            </w:r>
+          </w:p>
+        </w:tc>
+        <w:tc>
+          <w:tcPr>
+            <w:tcW w:type="dxa" w:w="3213"/>
+          </w:tcPr>
+          <w:p>
+            <w:r>
+              <w:t>注释写在规则块上方一次就够，逐行贴同一句反而干扰阅读。</w:t>
+            </w:r>
+          </w:p>
+        </w:tc>
+      </w:tr>
+      <w:tr>
+        <w:tc>
+          <w:tcPr>
+            <w:tcW w:type="dxa" w:w="3213"/>
+          </w:tcPr>
+          <w:p>
+            <w:r>
+              <w:t>过时注释没有清理</w:t>
+            </w:r>
+          </w:p>
+        </w:tc>
+        <w:tc>
+          <w:tcPr>
+            <w:tcW w:type="dxa" w:w="3213"/>
+          </w:tcPr>
+          <w:p>
+            <w:r>
+              <w:t>文件末尾还留着 10/26、10/27 的旧观察记录，其中「h3 的 margin 是 20px」那条当时答错了对象。</w:t>
+            </w:r>
+          </w:p>
+        </w:tc>
+        <w:tc>
+          <w:tcPr>
+            <w:tcW w:type="dxa" w:w="3213"/>
+          </w:tcPr>
+          <w:p>
+            <w:r>
+              <w:t>注释也是代码的一部分。过时的观察应该更新或删掉，否则以后自己会被它误导。</w:t>
+            </w:r>
+          </w:p>
+        </w:tc>
+      </w:tr>
+      <w:tr>
+        <w:tc>
+          <w:tcPr>
+            <w:tcW w:type="dxa" w:w="3213"/>
+          </w:tcPr>
+          <w:p>
+            <w:r>
+              <w:t>老师读文件时截断了内容（我的失误）</w:t>
+            </w:r>
+          </w:p>
+        </w:tc>
+        <w:tc>
+          <w:tcPr>
+            <w:tcW w:type="dxa" w:w="3213"/>
+          </w:tcPr>
+          <w:p>
+            <w:r>
+              <w:t>用 tail 查看 index.html 尾部，因为文件末尾有一大段注释块，脚本没被显示出来，差点误判「script 没加」。</w:t>
+            </w:r>
+          </w:p>
+        </w:tc>
+        <w:tc>
+          <w:tcPr>
+            <w:tcW w:type="dxa" w:w="3213"/>
+          </w:tcPr>
+          <w:p>
+            <w:r>
+              <w:t>检查学员作业时读完整文件或按关键词搜索，不要用固定行数的窗口去判断有无。</w:t>
+            </w:r>
+          </w:p>
+        </w:tc>
+      </w:tr>
+    </w:tbl>
+    <w:p>
+      <w:pPr>
+        <w:pStyle w:val="Heading3"/>
+      </w:pPr>
+      <w:r>
+        <w:t>二、新词与生词</w:t>
+      </w:r>
+    </w:p>
+    <w:tbl>
+      <w:tblPr>
+        <w:tblStyle w:val="TableGrid"/>
+        <w:tblW w:type="auto" w:w="0"/>
+        <w:tblLook w:firstColumn="1" w:firstRow="1" w:lastColumn="0" w:lastRow="0" w:noHBand="0" w:noVBand="1" w:val="04A0"/>
+      </w:tblPr>
+      <w:tblGrid>
+        <w:gridCol w:w="3213"/>
+        <w:gridCol w:w="3213"/>
+        <w:gridCol w:w="3213"/>
+      </w:tblGrid>
+      <w:tr>
+        <w:tc>
+          <w:tcPr>
+            <w:tcW w:type="dxa" w:w="3213"/>
+          </w:tcPr>
+          <w:p>
+            <w:r>
+              <w:rPr>
+                <w:b/>
+              </w:rPr>
+              <w:t>英文</w:t>
+            </w:r>
+          </w:p>
+        </w:tc>
+        <w:tc>
+          <w:tcPr>
+            <w:tcW w:type="dxa" w:w="3213"/>
+          </w:tcPr>
+          <w:p>
+            <w:r>
+              <w:rPr>
+                <w:b/>
+              </w:rPr>
+              <w:t>中文</w:t>
+            </w:r>
+          </w:p>
+        </w:tc>
+        <w:tc>
+          <w:tcPr>
+            <w:tcW w:type="dxa" w:w="3213"/>
+          </w:tcPr>
+          <w:p>
+            <w:r>
+              <w:rPr>
+                <w:b/>
+              </w:rPr>
+              <w:t>用大白话说</w:t>
+            </w:r>
+          </w:p>
+        </w:tc>
+      </w:tr>
+      <w:tr>
+        <w:tc>
+          <w:tcPr>
+            <w:tcW w:type="dxa" w:w="3213"/>
+          </w:tcPr>
+          <w:p>
+            <w:r>
+              <w:t>document flow</w:t>
+            </w:r>
+          </w:p>
+        </w:tc>
+        <w:tc>
+          <w:tcPr>
+            <w:tcW w:type="dxa" w:w="3213"/>
+          </w:tcPr>
+          <w:p>
+            <w:r>
+              <w:t>文档流</w:t>
+            </w:r>
+          </w:p>
+        </w:tc>
+        <w:tc>
+          <w:tcPr>
+            <w:tcW w:type="dxa" w:w="3213"/>
+          </w:tcPr>
+          <w:p>
+            <w:r>
+              <w:t>浏览器默认从上到下、从左到右排列元素的秩序</w:t>
+            </w:r>
+          </w:p>
+        </w:tc>
+      </w:tr>
+      <w:tr>
+        <w:tc>
+          <w:tcPr>
+            <w:tcW w:type="dxa" w:w="3213"/>
+          </w:tcPr>
+          <w:p>
+            <w:r>
+              <w:t>display: block</w:t>
+            </w:r>
+          </w:p>
+        </w:tc>
+        <w:tc>
+          <w:tcPr>
+            <w:tcW w:type="dxa" w:w="3213"/>
+          </w:tcPr>
+          <w:p>
+            <w:r>
+              <w:t>块级显示</w:t>
+            </w:r>
+          </w:p>
+        </w:tc>
+        <w:tc>
+          <w:tcPr>
+            <w:tcW w:type="dxa" w:w="3213"/>
+          </w:tcPr>
+          <w:p>
+            <w:r>
+              <w:t>独占一行，宽高可设</w:t>
+            </w:r>
+          </w:p>
+        </w:tc>
+      </w:tr>
+      <w:tr>
+        <w:tc>
+          <w:tcPr>
+            <w:tcW w:type="dxa" w:w="3213"/>
+          </w:tcPr>
+          <w:p>
+            <w:r>
+              <w:t>display: inline</w:t>
+            </w:r>
+          </w:p>
+        </w:tc>
+        <w:tc>
+          <w:tcPr>
+            <w:tcW w:type="dxa" w:w="3213"/>
+          </w:tcPr>
+          <w:p>
+            <w:r>
+              <w:t>行内显示</w:t>
+            </w:r>
+          </w:p>
+        </w:tc>
+        <w:tc>
+          <w:tcPr>
+            <w:tcW w:type="dxa" w:w="3213"/>
+          </w:tcPr>
+          <w:p>
+            <w:r>
+              <w:t>跟文字排一行，宽高设置无效</w:t>
+            </w:r>
+          </w:p>
+        </w:tc>
+      </w:tr>
+      <w:tr>
+        <w:tc>
+          <w:tcPr>
+            <w:tcW w:type="dxa" w:w="3213"/>
+          </w:tcPr>
+          <w:p>
+            <w:r>
+              <w:t>display: inline-block</w:t>
+            </w:r>
+          </w:p>
+        </w:tc>
+        <w:tc>
+          <w:tcPr>
+            <w:tcW w:type="dxa" w:w="3213"/>
+          </w:tcPr>
+          <w:p>
+            <w:r>
+              <w:t>行内块</w:t>
+            </w:r>
+          </w:p>
+        </w:tc>
+        <w:tc>
+          <w:tcPr>
+            <w:tcW w:type="dxa" w:w="3213"/>
+          </w:tcPr>
+          <w:p>
+            <w:r>
+              <w:t>能排一行，又能设宽高</w:t>
+            </w:r>
+          </w:p>
+        </w:tc>
+      </w:tr>
+      <w:tr>
+        <w:tc>
+          <w:tcPr>
+            <w:tcW w:type="dxa" w:w="3213"/>
+          </w:tcPr>
+          <w:p>
+            <w:r>
+              <w:t>display: none</w:t>
+            </w:r>
+          </w:p>
+        </w:tc>
+        <w:tc>
+          <w:tcPr>
+            <w:tcW w:type="dxa" w:w="3213"/>
+          </w:tcPr>
+          <w:p>
+            <w:r>
+              <w:t>不渲染</w:t>
+            </w:r>
+          </w:p>
+        </w:tc>
+        <w:tc>
+          <w:tcPr>
+            <w:tcW w:type="dxa" w:w="3213"/>
+          </w:tcPr>
+          <w:p>
+            <w:r>
+              <w:t>从页面和布局里彻底拿掉</w:t>
+            </w:r>
+          </w:p>
+        </w:tc>
+      </w:tr>
+      <w:tr>
+        <w:tc>
+          <w:tcPr>
+            <w:tcW w:type="dxa" w:w="3213"/>
+          </w:tcPr>
+          <w:p>
+            <w:r>
+              <w:t>visibility: hidden</w:t>
+            </w:r>
+          </w:p>
+        </w:tc>
+        <w:tc>
+          <w:tcPr>
+            <w:tcW w:type="dxa" w:w="3213"/>
+          </w:tcPr>
+          <w:p>
+            <w:r>
+              <w:t>不可见</w:t>
+            </w:r>
+          </w:p>
+        </w:tc>
+        <w:tc>
+          <w:tcPr>
+            <w:tcW w:type="dxa" w:w="3213"/>
+          </w:tcPr>
+          <w:p>
+            <w:r>
+              <w:t>看不见但保留占位，也无法点击</w:t>
+            </w:r>
+          </w:p>
+        </w:tc>
+      </w:tr>
+      <w:tr>
+        <w:tc>
+          <w:tcPr>
+            <w:tcW w:type="dxa" w:w="3213"/>
+          </w:tcPr>
+          <w:p>
+            <w:r>
+              <w:t>position: static</w:t>
+            </w:r>
+          </w:p>
+        </w:tc>
+        <w:tc>
+          <w:tcPr>
+            <w:tcW w:type="dxa" w:w="3213"/>
+          </w:tcPr>
+          <w:p>
+            <w:r>
+              <w:t>静态定位</w:t>
+            </w:r>
+          </w:p>
+        </w:tc>
+        <w:tc>
+          <w:tcPr>
+            <w:tcW w:type="dxa" w:w="3213"/>
+          </w:tcPr>
+          <w:p>
+            <w:r>
+              <w:t>默认值，不偏离、不脱离文档流</w:t>
+            </w:r>
+          </w:p>
+        </w:tc>
+      </w:tr>
+      <w:tr>
+        <w:tc>
+          <w:tcPr>
+            <w:tcW w:type="dxa" w:w="3213"/>
+          </w:tcPr>
+          <w:p>
+            <w:r>
+              <w:t>position: relative</w:t>
+            </w:r>
+          </w:p>
+        </w:tc>
+        <w:tc>
+          <w:tcPr>
+            <w:tcW w:type="dxa" w:w="3213"/>
+          </w:tcPr>
+          <w:p>
+            <w:r>
+              <w:t>相对定位</w:t>
+            </w:r>
+          </w:p>
+        </w:tc>
+        <w:tc>
+          <w:tcPr>
+            <w:tcW w:type="dxa" w:w="3213"/>
+          </w:tcPr>
+          <w:p>
+            <w:r>
+              <w:t>相对自己的原位置偏移，原位置仍占着</w:t>
+            </w:r>
+          </w:p>
+        </w:tc>
+      </w:tr>
+      <w:tr>
+        <w:tc>
+          <w:tcPr>
+            <w:tcW w:type="dxa" w:w="3213"/>
+          </w:tcPr>
+          <w:p>
+            <w:r>
+              <w:t>position: absolute</w:t>
+            </w:r>
+          </w:p>
+        </w:tc>
+        <w:tc>
+          <w:tcPr>
+            <w:tcW w:type="dxa" w:w="3213"/>
+          </w:tcPr>
+          <w:p>
+            <w:r>
+              <w:t>绝对定位</w:t>
+            </w:r>
+          </w:p>
+        </w:tc>
+        <w:tc>
+          <w:tcPr>
+            <w:tcW w:type="dxa" w:w="3213"/>
+          </w:tcPr>
+          <w:p>
+            <w:r>
+              <w:t>相对最近的已定位祖先定位，脱离文档流</w:t>
+            </w:r>
+          </w:p>
+        </w:tc>
+      </w:tr>
+      <w:tr>
+        <w:tc>
+          <w:tcPr>
+            <w:tcW w:type="dxa" w:w="3213"/>
+          </w:tcPr>
+          <w:p>
+            <w:r>
+              <w:t>position: fixed</w:t>
+            </w:r>
+          </w:p>
+        </w:tc>
+        <w:tc>
+          <w:tcPr>
+            <w:tcW w:type="dxa" w:w="3213"/>
+          </w:tcPr>
+          <w:p>
+            <w:r>
+              <w:t>固定定位</w:t>
+            </w:r>
+          </w:p>
+        </w:tc>
+        <w:tc>
+          <w:tcPr>
+            <w:tcW w:type="dxa" w:w="3213"/>
+          </w:tcPr>
+          <w:p>
+            <w:r>
+              <w:t>相对浏览器视口定位，滚动时不动</w:t>
+            </w:r>
+          </w:p>
+        </w:tc>
+      </w:tr>
+      <w:tr>
+        <w:tc>
+          <w:tcPr>
+            <w:tcW w:type="dxa" w:w="3213"/>
+          </w:tcPr>
+          <w:p>
+            <w:r>
+              <w:t>position: sticky</w:t>
+            </w:r>
+          </w:p>
+        </w:tc>
+        <w:tc>
+          <w:tcPr>
+            <w:tcW w:type="dxa" w:w="3213"/>
+          </w:tcPr>
+          <w:p>
+            <w:r>
+              <w:t>粘性定位</w:t>
+            </w:r>
+          </w:p>
+        </w:tc>
+        <w:tc>
+          <w:tcPr>
+            <w:tcW w:type="dxa" w:w="3213"/>
+          </w:tcPr>
+          <w:p>
+            <w:r>
+              <w:t>正常流动，滚到阈值后吸附</w:t>
+            </w:r>
+          </w:p>
+        </w:tc>
+      </w:tr>
+      <w:tr>
+        <w:tc>
+          <w:tcPr>
+            <w:tcW w:type="dxa" w:w="3213"/>
+          </w:tcPr>
+          <w:p>
+            <w:r>
+              <w:t>containing block</w:t>
+            </w:r>
+          </w:p>
+        </w:tc>
+        <w:tc>
+          <w:tcPr>
+            <w:tcW w:type="dxa" w:w="3213"/>
+          </w:tcPr>
+          <w:p>
+            <w:r>
+              <w:t>包含块</w:t>
+            </w:r>
+          </w:p>
+        </w:tc>
+        <w:tc>
+          <w:tcPr>
+            <w:tcW w:type="dxa" w:w="3213"/>
+          </w:tcPr>
+          <w:p>
+            <w:r>
+              <w:t>定位时用来量距离的那个参照盒子</w:t>
+            </w:r>
+          </w:p>
+        </w:tc>
+      </w:tr>
+      <w:tr>
+        <w:tc>
+          <w:tcPr>
+            <w:tcW w:type="dxa" w:w="3213"/>
+          </w:tcPr>
+          <w:p>
+            <w:r>
+              <w:t>z-index</w:t>
+            </w:r>
+          </w:p>
+        </w:tc>
+        <w:tc>
+          <w:tcPr>
+            <w:tcW w:type="dxa" w:w="3213"/>
+          </w:tcPr>
+          <w:p>
+            <w:r>
+              <w:t>层叠顺序</w:t>
+            </w:r>
+          </w:p>
+        </w:tc>
+        <w:tc>
+          <w:tcPr>
+            <w:tcW w:type="dxa" w:w="3213"/>
+          </w:tcPr>
+          <w:p>
+            <w:r>
+              <w:t>决定重叠时谁在上层，只对定位元素生效</w:t>
+            </w:r>
+          </w:p>
+        </w:tc>
+      </w:tr>
+      <w:tr>
+        <w:tc>
+          <w:tcPr>
+            <w:tcW w:type="dxa" w:w="3213"/>
+          </w:tcPr>
+          <w:p>
+            <w:r>
+              <w:t>stacking context</w:t>
+            </w:r>
+          </w:p>
+        </w:tc>
+        <w:tc>
+          <w:tcPr>
+            <w:tcW w:type="dxa" w:w="3213"/>
+          </w:tcPr>
+          <w:p>
+            <w:r>
+              <w:t>堆叠上下文</w:t>
+            </w:r>
+          </w:p>
+        </w:tc>
+        <w:tc>
+          <w:tcPr>
+            <w:tcW w:type="dxa" w:w="3213"/>
+          </w:tcPr>
+          <w:p>
+            <w:r>
+              <w:t>z-index 的比较范围，超出范围不参与比较</w:t>
+            </w:r>
+          </w:p>
+        </w:tc>
+      </w:tr>
+      <w:tr>
+        <w:tc>
+          <w:tcPr>
+            <w:tcW w:type="dxa" w:w="3213"/>
+          </w:tcPr>
+          <w:p>
+            <w:r>
+              <w:t>querySelector</w:t>
+            </w:r>
+          </w:p>
+        </w:tc>
+        <w:tc>
+          <w:tcPr>
+            <w:tcW w:type="dxa" w:w="3213"/>
+          </w:tcPr>
+          <w:p>
+            <w:r>
+              <w:t>查询元素</w:t>
+            </w:r>
+          </w:p>
+        </w:tc>
+        <w:tc>
+          <w:tcPr>
+            <w:tcW w:type="dxa" w:w="3213"/>
+          </w:tcPr>
+          <w:p>
+            <w:r>
+              <w:t>JS 里按 CSS 选择器找元素的写法</w:t>
+            </w:r>
+          </w:p>
+        </w:tc>
+      </w:tr>
+      <w:tr>
+        <w:tc>
+          <w:tcPr>
+            <w:tcW w:type="dxa" w:w="3213"/>
+          </w:tcPr>
+          <w:p>
+            <w:r>
+              <w:t>addEventListener</w:t>
+            </w:r>
+          </w:p>
+        </w:tc>
+        <w:tc>
+          <w:tcPr>
+            <w:tcW w:type="dxa" w:w="3213"/>
+          </w:tcPr>
+          <w:p>
+            <w:r>
+              <w:t>事件监听</w:t>
+            </w:r>
+          </w:p>
+        </w:tc>
+        <w:tc>
+          <w:tcPr>
+            <w:tcW w:type="dxa" w:w="3213"/>
+          </w:tcPr>
+          <w:p>
+            <w:r>
+              <w:t>告诉浏览器「发生某件事时执行这段代码」</w:t>
+            </w:r>
+          </w:p>
+        </w:tc>
+      </w:tr>
+      <w:tr>
+        <w:tc>
+          <w:tcPr>
+            <w:tcW w:type="dxa" w:w="3213"/>
+          </w:tcPr>
+          <w:p>
+            <w:r>
+              <w:t>scrollY</w:t>
+            </w:r>
+          </w:p>
+        </w:tc>
+        <w:tc>
+          <w:tcPr>
+            <w:tcW w:type="dxa" w:w="3213"/>
+          </w:tcPr>
+          <w:p>
+            <w:r>
+              <w:t>滚动距离</w:t>
+            </w:r>
+          </w:p>
+        </w:tc>
+        <w:tc>
+          <w:tcPr>
+            <w:tcW w:type="dxa" w:w="3213"/>
+          </w:tcPr>
+          <w:p>
+            <w:r>
+              <w:t>页面已经向下滚动了多少像素</w:t>
+            </w:r>
+          </w:p>
+        </w:tc>
+      </w:tr>
+      <w:tr>
+        <w:tc>
+          <w:tcPr>
+            <w:tcW w:type="dxa" w:w="3213"/>
+          </w:tcPr>
+          <w:p>
+            <w:r>
+              <w:t>classList.toggle</w:t>
+            </w:r>
+          </w:p>
+        </w:tc>
+        <w:tc>
+          <w:tcPr>
+            <w:tcW w:type="dxa" w:w="3213"/>
+          </w:tcPr>
+          <w:p>
+            <w:r>
+              <w:t>切换类名</w:t>
+            </w:r>
+          </w:p>
+        </w:tc>
+        <w:tc>
+          <w:tcPr>
+            <w:tcW w:type="dxa" w:w="3213"/>
+          </w:tcPr>
+          <w:p>
+            <w:r>
+              <w:t>条件为真时加类，为假时去掉</w:t>
+            </w:r>
+          </w:p>
+        </w:tc>
+      </w:tr>
+      <w:tr>
+        <w:tc>
+          <w:tcPr>
+            <w:tcW w:type="dxa" w:w="3213"/>
+          </w:tcPr>
+          <w:p>
+            <w:r>
+              <w:t>transition</w:t>
+            </w:r>
+          </w:p>
+        </w:tc>
+        <w:tc>
+          <w:tcPr>
+            <w:tcW w:type="dxa" w:w="3213"/>
+          </w:tcPr>
+          <w:p>
+            <w:r>
+              <w:t>过渡</w:t>
+            </w:r>
+          </w:p>
+        </w:tc>
+        <w:tc>
+          <w:tcPr>
+            <w:tcW w:type="dxa" w:w="3213"/>
+          </w:tcPr>
+          <w:p>
+            <w:r>
+              <w:t>属性变化时用一段时间平滑过渡</w:t>
+            </w:r>
+          </w:p>
+        </w:tc>
+      </w:tr>
+      <w:tr>
+        <w:tc>
+          <w:tcPr>
+            <w:tcW w:type="dxa" w:w="3213"/>
+          </w:tcPr>
+          <w:p>
+            <w:r>
+              <w:t>progressive enhancement</w:t>
+            </w:r>
+          </w:p>
+        </w:tc>
+        <w:tc>
+          <w:tcPr>
+            <w:tcW w:type="dxa" w:w="3213"/>
+          </w:tcPr>
+          <w:p>
+            <w:r>
+              <w:t>渐进增强</w:t>
+            </w:r>
+          </w:p>
+        </w:tc>
+        <w:tc>
+          <w:tcPr>
+            <w:tcW w:type="dxa" w:w="3213"/>
+          </w:tcPr>
+          <w:p>
+            <w:r>
+              <w:t>基础功能不依赖 JS，增强体验才用 JS</w:t>
+            </w:r>
+          </w:p>
+        </w:tc>
+      </w:tr>
+    </w:tbl>
+    <w:p>
+      <w:pPr>
+        <w:pStyle w:val="Heading3"/>
+      </w:pPr>
+      <w:r>
+        <w:t>三、今天学到的新知识</w:t>
+      </w:r>
+    </w:p>
+    <w:p>
+      <w:pPr>
+        <w:pStyle w:val="ListBullet"/>
+      </w:pPr>
+      <w:r>
+        <w:t>display 和 position 都在改变元素在文档流里的行为：display 决定怎么占位置，position 决定还在不在流里。</w:t>
+      </w:r>
+    </w:p>
+    <w:p>
+      <w:pPr>
+        <w:pStyle w:val="ListBullet"/>
+      </w:pPr>
+      <w:r>
+        <w:t>行内元素（inline）的 width 和 height 会被浏览器直接忽略，这是 span / a 设了宽高却没反应的原因。</w:t>
+      </w:r>
+    </w:p>
+    <w:p>
+      <w:pPr>
+        <w:pStyle w:val="ListBullet"/>
+      </w:pPr>
+      <w:r>
+        <w:t>display: none 不占位置，后面的元素会顶上来；visibility: hidden 占着位置，只是看不见、也不能点。</w:t>
+      </w:r>
+    </w:p>
+    <w:p>
+      <w:pPr>
+        <w:pStyle w:val="ListBullet"/>
+      </w:pPr>
+      <w:r>
+        <w:t>position: relative 不带偏移值时不移动任何东西，它的实际用途是「给子元素划一块定位范围」。</w:t>
+      </w:r>
+    </w:p>
+    <w:p>
+      <w:pPr>
+        <w:pStyle w:val="ListBullet"/>
+      </w:pPr>
+      <w:r>
+        <w:t>absolute 的参照物是「最近的、position 不是 static 的祖先」；一路往上都没有时，相对整个页面（html）定位。</w:t>
+      </w:r>
+    </w:p>
+    <w:p>
+      <w:pPr>
+        <w:pStyle w:val="ListBullet"/>
+      </w:pPr>
+      <w:r>
+        <w:t>父相子绝：父元素 position: relative，子元素 position: absolute。角标、下拉菜单、关闭按钮都是这个组合。</w:t>
+      </w:r>
+    </w:p>
+    <w:p>
+      <w:pPr>
+        <w:pStyle w:val="ListBullet"/>
+      </w:pPr>
+      <w:r>
+        <w:t>z-index 只对定位元素生效，且只在同一个堆叠上下文内比较；不写时按 HTML 顺序，后面的盖前面的。</w:t>
+      </w:r>
+    </w:p>
+    <w:p>
+      <w:pPr>
+        <w:pStyle w:val="ListBullet"/>
+      </w:pPr>
+      <w:r>
+        <w:t>滚动触发的显隐可以用 CSS 的 animation-timeline: scroll() 实现，但 Firefox 目前不支持，所以真实站点仍以 JS 为主。</w:t>
+      </w:r>
+    </w:p>
+    <w:p>
+      <w:pPr>
+        <w:pStyle w:val="ListBullet"/>
+      </w:pPr>
+      <w:r>
+        <w:t>JS 里 document.querySelector('.to-top') 和 CSS 的 .to-top 选的是同一个元素，只是换了语言的写法。</w:t>
+      </w:r>
+    </w:p>
+    <w:p>
+      <w:pPr>
+        <w:pStyle w:val="ListBullet"/>
+      </w:pPr>
+      <w:r>
+        <w:t>操作不可见元素时要同时处理两个属性：opacity 管「看不看得见」，visibility 管「能不能点」。只用 opacity: 0 时按钮仍然可以被点到。</w:t>
+      </w:r>
+    </w:p>
+    <w:p>
+      <w:pPr>
+        <w:pStyle w:val="Heading3"/>
+      </w:pPr>
+      <w:r>
+        <w:t>四、今天的产出</w:t>
+      </w:r>
+    </w:p>
+    <w:p>
+      <w:pPr>
+        <w:pStyle w:val="ListBullet"/>
+      </w:pPr>
+      <w:r>
+        <w:t>导航链接改为 inline-block + padding，hover 有背景色，三个页面的分隔符全部去掉</w:t>
+      </w:r>
+    </w:p>
+    <w:p>
+      <w:pPr>
+        <w:pStyle w:val="ListBullet"/>
+      </w:pPr>
+      <w:r>
+        <w:t>.post 加 position: relative，日期用 absolute 定位到卡片右上角</w:t>
+      </w:r>
+    </w:p>
+    <w:p>
+      <w:pPr>
+        <w:pStyle w:val="ListBullet"/>
+      </w:pPr>
+      <w:r>
+        <w:t>新增固定定位的「回到顶部」按钮，滚动 300px 后才淡入，用 JS 监听 scroll 事件</w:t>
+      </w:r>
+    </w:p>
+    <w:p>
+      <w:pPr>
+        <w:pStyle w:val="ListBullet"/>
+      </w:pPr>
+      <w:r>
+        <w:t>实测：返回顶部按钮在页面顶部隐藏且不可点击，下滑后淡入</w:t>
+      </w:r>
+    </w:p>
+    <w:p>
+      <w:pPr>
+        <w:pStyle w:val="ListBullet"/>
+      </w:pPr>
+      <w:r>
+        <w:t>验证：main.css 12 条规则、括号配对正确，四个地址均返回 HTTP 200</w:t>
+      </w:r>
+    </w:p>
+    <w:p>
+      <w:pPr>
+        <w:pStyle w:val="ListBullet"/>
+      </w:pPr>
+      <w:r>
+        <w:t>提交：feat: Day8 布局改造（导航按钮、日期角标、回到顶部按钮）</w:t>
+      </w:r>
+    </w:p>
+    <w:p>
+      <w:pPr>
+        <w:pStyle w:val="Heading3"/>
+      </w:pPr>
+      <w:r>
+        <w:t>五、明天要做的</w:t>
+      </w:r>
+    </w:p>
+    <w:p>
+      <w:r>
+        <w:t>Flexbox 上：主轴与交叉轴、flex-direction、justify-content、align-items、gap、flex 简写。学完之后导航会真正排成一行，卡片列表也能并排——这是整周最重要的一节。</w:t>
+      </w:r>
+    </w:p>
     <w:sectPr>
       <w:headerReference w:type="default" r:id="rId9"/>
       <w:footerReference w:type="default" r:id="rId10"/>

</xml_diff>